<commit_message>
docs: refresh SAD live references and qualification status
Use current canonical architecture identities and describe the accepted
September 30 qualification and committed source accurately. Preserve pending
installed-context, formal-agent and wider M28/M29 acceptance boundaries.

Externally reviewed documentary successor to b921faf. Runtime, package,
schema, configuration, baseline, hooks and tests are unchanged.
</commit_message>
<xml_diff>
--- a/GT-KB_System_Architecture_Document_Target_EndState.docx
+++ b/GT-KB_System_Architecture_Document_Target_EndState.docx
@@ -193,7 +193,7 @@
                 <w:color w:val="1E293B"/>
                 <w:sz w:val="18"/>
               </w:rPr>
-              <w:t xml:space="preserve">Isolated September 30 correction draft against released c124 (a633aba). Informative architecture reference; release qualification remains pending.</w:t>
+              <w:t xml:space="preserve">Isolated September 30 correction draft against released c124 (a633aba). Informative architecture reference; core source/installed executable qualification is accepted. Production installation, actual installed native context delivery and formal-agent pilot acceptance remain pending.</w:t>
             </w:r>
           </w:p>
         </w:tc>
@@ -560,7 +560,7 @@
           <w:color w:val="222222"/>
           <w:sz w:val="21"/>
         </w:rPr>
-        <w:t xml:space="preserve">This document has no independent authority. It separates current owner and active formal intent from source-backed implementation and planned capabilities. Source integration uses released c124 (a633aba), including the 8767 Dashboard default. WP0, WP2 and WP3 are not reported as installed. WP6 context, baseline Skills and model-admission code remains proposed and unqualified; ADR v5 and REQ v3 descriptions are applied. Current typed row version and status control citations where a description body has an older header.</w:t>
+        <w:t xml:space="preserve">This document has no independent authority. It separates current owner and active formal intent from source-backed implementation and planned capabilities. The core correction is based on released c124 (a633aba), including the 8767 Dashboard default, and is committed and pushed as b921faf83cc304ccbc2dc25db3288977145cbec7. Production remains on c124; WP0, WP2 and WP3 are not reported as installed there. The minimum WP6 context, baseline Skills and model-admission code is included in the accepted effective core source/installed executable qualification. Actual installed native context delivery and formal-agent pilot acceptance remain unproved. Designated ADR and REQ description amendments are applied. Current typed row version and status control citations where a description body has an older header.</w:t>
       </w:r>
     </w:p>
     <w:p>
@@ -4159,7 +4159,7 @@
                 <w:sz w:val="21"/>
                 <w:szCs w:val="21"/>
               </w:rPr>
-              <w:t xml:space="preserve">test_services_control.py; authored service/Home, Dashboard and control mocks. WP3 qualification and independent verification remain required.</w:t>
+              <w:t xml:space="preserve">test_services_control.py; authored service/Home, Dashboard and control mocks. Core WP3 executable qualification is accepted. Production installation and independent verification of changed live operations remain pending.</w:t>
             </w:r>
           </w:p>
         </w:tc>
@@ -4476,7 +4476,7 @@
           <w:color w:val="222222"/>
           <w:sz w:val="21"/>
         </w:rPr>
-        <w:t xml:space="preserve">The SAD is informative. ADR-SPEC-COVERAGE-ARCHITECTURE-001 row version 5 defines the WP6 minimum native work-item composer: explicit successor role and activity, current linked facts, named SAD and baseline excerpts, and additive sender-selected critical sources. This message-context floor carries no authority and is not the full M29 applicability or shard-compiler result. Complete current-corpus discovery and independent verification remain required.</w:t>
+        <w:t xml:space="preserve">The SAD is informative. ADR-SPEC-COVERAGE-ARCHITECTURE-001 defines the minimum native work-item composer, with its current canonical source identity supplied by live readers. The composer uses explicit successor role and activity, current linked facts, named SAD and baseline excerpts, and additive sender-selected critical sources. This message-context floor carries no authority and is not the full M29 applicability or shard-compiler result. Complete applicable-current-source investigation, adjacent requirement discovery and independent verification remain required. The full typed corpus, relationship and project-delta compiler remains planned and unqualified.</w:t>
       </w:r>
     </w:p>
     <w:p>
@@ -7495,7 +7495,7 @@
           <w:color w:val="222222"/>
           <w:sz w:val="21"/>
         </w:rPr>
-        <w:t xml:space="preserve">GTKB activity is explicitly selected: build, test, spec, deliberation, project or ops. WP3 permits Prime Builder operations in ops under the existing exact eight-field bound: operation, targets, preconditions, permitted effects, expiry, verification, containment and rollback. The installed gate still refuses harness owner-operation paths; the corrections are prepared and not installed. Prepared Dashboard start, stop and foreground serve use standard resolved paths and settings. Foreground startup and first readiness must meet the existing admission deadline; the running service and its owned cleanup need no new lifetime timer or per-refresh claim. Cleanup confirms listener, scheduler and request-handler termination. Bounded installation preparation covers an absent standard destination or a verified pinned existing installation, with owned staging, exact process checks and captured-only cleanup. Divergent existing trees and unsupported custom or skip settings are refused before destination mutation. Direct owner routes remain available. Executable qualification remains pending.</w:t>
+        <w:t xml:space="preserve">GTKB activity is explicitly selected: build, test, spec, deliberation, project or ops. WP3 permits Prime Builder operations in ops under the existing exact eight-field bound: operation, targets, preconditions, permitted effects, expiry, verification, containment and rollback. The production gate still refuses harness owner-operation paths; the core corrections are qualified and committed, with production installation pending. Prepared Dashboard start, stop and foreground serve use standard resolved paths and settings. Foreground startup and first readiness must meet the existing admission deadline; the running service and its owned cleanup need no new lifetime timer or per-refresh claim. Cleanup confirms listener, scheduler and request-handler termination. Bounded installation preparation covers an absent standard destination or a verified pinned existing installation, with owned staging, exact process checks and captured-only cleanup. Divergent existing trees and unsupported custom or skip settings are refused before destination mutation. Direct owner routes remain available. Core source/installed executable qualification is accepted. Production installation and independent verification of changed live operations remain pending.</w:t>
       </w:r>
     </w:p>
     <w:p>
@@ -8992,7 +8992,7 @@
           <w:color w:val="222222"/>
           <w:sz w:val="21"/>
         </w:rPr>
-        <w:t xml:space="preserve">External source review and rendered inspection support this isolated OVERWATCH preparation. Designated canonical amendments are applied; product qualification, publication and installation remain pending. It authorizes no work and retires no temporary owner guidance. Integration requires refreshed in-tree source, installed release and cited canonical records, reconciliation of intervening material changes and rendered inspection. Earlier attribution stays in the unchanged precursor rather than supplying approval for this draft.</w:t>
+        <w:t xml:space="preserve">External source review and rendered inspection support this isolated OVERWATCH preparation. Designated canonical amendments are applied; core executable qualification is accepted and core source is committed and pushed. Publication of this separate DOCX revision, production installation, actual installed native context delivery and formal-agent pilot acceptance remain pending. It authorizes no work and retires no temporary owner guidance. Integration requires refreshed in-tree source, installed release and cited canonical records, reconciliation of intervening material changes and rendered inspection. Earlier attribution stays in the unchanged precursor rather than supplying approval for this draft.</w:t>
       </w:r>
     </w:p>
     <w:p>

</xml_diff>